<commit_message>
Prototype Math T5 : structure fidèle à la fiche validée
Co-authored-by: arena-agent <297053741+arena-agent@users.noreply.github.com>
</commit_message>
<xml_diff>
--- a/manuel-math-t5/PROTOTYPE_FICHE_LECON_NOMBRES.docx
+++ b/manuel-math-t5/PROTOTYPE_FICHE_LECON_NOMBRES.docx
@@ -42,26 +42,6 @@
     </w:p>
     <w:p>
       <w:pPr>
-        <w:shd w:fill="EEF4F8" w:val="clear"/>
-        <w:spacing w:after="110" w:before="0" w:line="300"/>
-        <w:jc w:val="left"/>
-      </w:pPr>
-      <w:r>
-        <w:rPr>
-          <w:rFonts w:ascii="Times New Roman" w:cs="Times New Roman" w:eastAsia="Times New Roman" w:hAnsi="Times New Roman"/>
-          <w:b/>
-          <w:bCs/>
-          <w:i w:val="false"/>
-          <w:iCs w:val="false"/>
-          <w:color w:val="222222"/>
-          <w:sz w:val="24"/>
-          <w:szCs w:val="24"/>
-        </w:rPr>
-        <w:t xml:space="preserve">Objectif : lire un nombre de six chiffres et l’écrire sans oublier les zéros.</w:t>
-      </w:r>
-    </w:p>
-    <w:p>
-      <w:pPr>
         <w:spacing w:after="100" w:before="180"/>
       </w:pPr>
       <w:r>
@@ -75,12 +55,13 @@
           <w:sz w:val="28"/>
           <w:szCs w:val="28"/>
         </w:rPr>
-        <w:t xml:space="preserve">1. Je regroupe les chiffres par classes</w:t>
-      </w:r>
-    </w:p>
-    <w:p>
-      <w:pPr>
-        <w:spacing w:after="70" w:line="300"/>
+        <w:t xml:space="preserve">1. Les nombres jusqu’à 1 000 000</w:t>
+      </w:r>
+    </w:p>
+    <w:p>
+      <w:pPr>
+        <w:spacing w:after="110" w:before="0" w:line="300"/>
+        <w:jc w:val="left"/>
       </w:pPr>
       <w:r>
         <w:rPr>
@@ -93,7 +74,64 @@
           <w:sz w:val="24"/>
           <w:szCs w:val="24"/>
         </w:rPr>
-        <w:t xml:space="preserve">On part de la droite. Chaque classe contient trois colonnes : centaines, dizaines, unités.</w:t>
+        <w:t xml:space="preserve">Pour ne pas se tromper, on écrit le nombre de droite à gauche, une case à la fois. On sépare d’abord le nombre en groupes de trois chiffres à partir de la droite.</w:t>
+      </w:r>
+    </w:p>
+    <w:p>
+      <w:pPr>
+        <w:spacing w:after="60" w:before="0" w:line="300"/>
+        <w:jc w:val="left"/>
+      </w:pPr>
+      <w:r>
+        <w:rPr>
+          <w:rFonts w:ascii="Times New Roman" w:cs="Times New Roman" w:eastAsia="Times New Roman" w:hAnsi="Times New Roman"/>
+          <w:b w:val="false"/>
+          <w:bCs w:val="false"/>
+          <w:i w:val="false"/>
+          <w:iCs w:val="false"/>
+          <w:color w:val="222222"/>
+          <w:sz w:val="24"/>
+          <w:szCs w:val="24"/>
+        </w:rPr>
+        <w:t xml:space="preserve">On prend l’exemple :</w:t>
+      </w:r>
+    </w:p>
+    <w:p>
+      <w:pPr>
+        <w:spacing w:after="80" w:before="0" w:line="300"/>
+        <w:jc w:val="center"/>
+      </w:pPr>
+      <w:r>
+        <w:rPr>
+          <w:rFonts w:ascii="Times New Roman" w:cs="Times New Roman" w:eastAsia="Times New Roman" w:hAnsi="Times New Roman"/>
+          <w:b/>
+          <w:bCs/>
+          <w:i w:val="false"/>
+          <w:iCs w:val="false"/>
+          <w:color w:val="A61C00"/>
+          <w:sz w:val="32"/>
+          <w:szCs w:val="32"/>
+        </w:rPr>
+        <w:t xml:space="preserve">2 343 216</w:t>
+      </w:r>
+    </w:p>
+    <w:p>
+      <w:pPr>
+        <w:spacing w:after="120" w:before="0" w:line="300"/>
+        <w:jc w:val="center"/>
+      </w:pPr>
+      <w:r>
+        <w:rPr>
+          <w:rFonts w:ascii="Times New Roman" w:cs="Times New Roman" w:eastAsia="Times New Roman" w:hAnsi="Times New Roman"/>
+          <w:b/>
+          <w:bCs/>
+          <w:i w:val="false"/>
+          <w:iCs w:val="false"/>
+          <w:color w:val="1F4E79"/>
+          <w:sz w:val="28"/>
+          <w:szCs w:val="28"/>
+        </w:rPr>
+        <w:t xml:space="preserve">2 | 343 | 216</w:t>
       </w:r>
     </w:p>
     <w:tbl>
@@ -110,13 +148,20 @@
         <w:tblLayout w:type="fixed"/>
       </w:tblPr>
       <w:tblGrid>
-        <w:gridCol w:w="50"/>
-        <w:gridCol w:w="50"/>
+        <w:gridCol w:w="1090"/>
+        <w:gridCol w:w="1090"/>
+        <w:gridCol w:w="1090"/>
+        <w:gridCol w:w="1090"/>
+        <w:gridCol w:w="1090"/>
+        <w:gridCol w:w="1090"/>
+        <w:gridCol w:w="1090"/>
+        <w:gridCol w:w="1090"/>
+        <w:gridCol w:w="1090"/>
       </w:tblGrid>
       <w:tr>
         <w:tc>
           <w:tcPr>
-            <w:tcW w:type="pct" w:w="2500"/>
+            <w:gridSpan w:val="3"/>
             <w:shd w:fill="EEF4F8" w:val="clear"/>
             <w:tcMar>
               <w:top w:type="dxa" w:w="90"/>
@@ -141,13 +186,44 @@
                 <w:sz w:val="22"/>
                 <w:szCs w:val="22"/>
               </w:rPr>
-              <w:t xml:space="preserve">CLASSE DES MILLE</w:t>
-            </w:r>
-          </w:p>
-        </w:tc>
-        <w:tc>
-          <w:tcPr>
-            <w:tcW w:type="pct" w:w="2500"/>
+              <w:t xml:space="preserve">MILLIONS</w:t>
+            </w:r>
+          </w:p>
+        </w:tc>
+        <w:tc>
+          <w:tcPr>
+            <w:gridSpan w:val="3"/>
+            <w:shd w:fill="EEF4F8" w:val="clear"/>
+            <w:tcMar>
+              <w:top w:type="dxa" w:w="90"/>
+              <w:left w:type="dxa" w:w="100"/>
+              <w:bottom w:type="dxa" w:w="90"/>
+              <w:right w:type="dxa" w:w="100"/>
+            </w:tcMar>
+          </w:tcPr>
+          <w:p>
+            <w:pPr>
+              <w:spacing w:after="0" w:before="0" w:line="300"/>
+              <w:jc w:val="center"/>
+            </w:pPr>
+            <w:r>
+              <w:rPr>
+                <w:rFonts w:ascii="Times New Roman" w:cs="Times New Roman" w:eastAsia="Times New Roman" w:hAnsi="Times New Roman"/>
+                <w:b/>
+                <w:bCs/>
+                <w:i w:val="false"/>
+                <w:iCs w:val="false"/>
+                <w:color w:val="1F4E79"/>
+                <w:sz w:val="22"/>
+                <w:szCs w:val="22"/>
+              </w:rPr>
+              <w:t xml:space="preserve">MILLE</w:t>
+            </w:r>
+          </w:p>
+        </w:tc>
+        <w:tc>
+          <w:tcPr>
+            <w:gridSpan w:val="3"/>
             <w:shd w:fill="E8F5E9" w:val="clear"/>
             <w:tcMar>
               <w:top w:type="dxa" w:w="90"/>
@@ -172,7 +248,7 @@
                 <w:sz w:val="22"/>
                 <w:szCs w:val="22"/>
               </w:rPr>
-              <w:t xml:space="preserve">CLASSE DES UNITÉS</w:t>
+              <w:t xml:space="preserve">UNITÉS</w:t>
             </w:r>
           </w:p>
         </w:tc>
@@ -180,7 +256,7 @@
       <w:tr>
         <w:tc>
           <w:tcPr>
-            <w:tcW w:type="pct" w:w="2500"/>
+            <w:shd w:fill="EEF4F8" w:val="clear"/>
             <w:tcMar>
               <w:top w:type="dxa" w:w="90"/>
               <w:left w:type="dxa" w:w="100"/>
@@ -204,13 +280,163 @@
                 <w:sz w:val="22"/>
                 <w:szCs w:val="22"/>
               </w:rPr>
-              <w:t xml:space="preserve">C   D   U</w:t>
-            </w:r>
-          </w:p>
-        </w:tc>
-        <w:tc>
-          <w:tcPr>
-            <w:tcW w:type="pct" w:w="2500"/>
+              <w:t xml:space="preserve">C</w:t>
+            </w:r>
+          </w:p>
+        </w:tc>
+        <w:tc>
+          <w:tcPr>
+            <w:shd w:fill="EEF4F8" w:val="clear"/>
+            <w:tcMar>
+              <w:top w:type="dxa" w:w="90"/>
+              <w:left w:type="dxa" w:w="100"/>
+              <w:bottom w:type="dxa" w:w="90"/>
+              <w:right w:type="dxa" w:w="100"/>
+            </w:tcMar>
+          </w:tcPr>
+          <w:p>
+            <w:pPr>
+              <w:spacing w:after="0" w:before="0" w:line="300"/>
+              <w:jc w:val="center"/>
+            </w:pPr>
+            <w:r>
+              <w:rPr>
+                <w:rFonts w:ascii="Times New Roman" w:cs="Times New Roman" w:eastAsia="Times New Roman" w:hAnsi="Times New Roman"/>
+                <w:b/>
+                <w:bCs/>
+                <w:i w:val="false"/>
+                <w:iCs w:val="false"/>
+                <w:color w:val="1F4E79"/>
+                <w:sz w:val="22"/>
+                <w:szCs w:val="22"/>
+              </w:rPr>
+              <w:t xml:space="preserve">D</w:t>
+            </w:r>
+          </w:p>
+        </w:tc>
+        <w:tc>
+          <w:tcPr>
+            <w:shd w:fill="EEF4F8" w:val="clear"/>
+            <w:tcMar>
+              <w:top w:type="dxa" w:w="90"/>
+              <w:left w:type="dxa" w:w="100"/>
+              <w:bottom w:type="dxa" w:w="90"/>
+              <w:right w:type="dxa" w:w="100"/>
+            </w:tcMar>
+          </w:tcPr>
+          <w:p>
+            <w:pPr>
+              <w:spacing w:after="0" w:before="0" w:line="300"/>
+              <w:jc w:val="center"/>
+            </w:pPr>
+            <w:r>
+              <w:rPr>
+                <w:rFonts w:ascii="Times New Roman" w:cs="Times New Roman" w:eastAsia="Times New Roman" w:hAnsi="Times New Roman"/>
+                <w:b/>
+                <w:bCs/>
+                <w:i w:val="false"/>
+                <w:iCs w:val="false"/>
+                <w:color w:val="1F4E79"/>
+                <w:sz w:val="22"/>
+                <w:szCs w:val="22"/>
+              </w:rPr>
+              <w:t xml:space="preserve">U</w:t>
+            </w:r>
+          </w:p>
+        </w:tc>
+        <w:tc>
+          <w:tcPr>
+            <w:shd w:fill="EEF4F8" w:val="clear"/>
+            <w:tcMar>
+              <w:top w:type="dxa" w:w="90"/>
+              <w:left w:type="dxa" w:w="100"/>
+              <w:bottom w:type="dxa" w:w="90"/>
+              <w:right w:type="dxa" w:w="100"/>
+            </w:tcMar>
+          </w:tcPr>
+          <w:p>
+            <w:pPr>
+              <w:spacing w:after="0" w:before="0" w:line="300"/>
+              <w:jc w:val="center"/>
+            </w:pPr>
+            <w:r>
+              <w:rPr>
+                <w:rFonts w:ascii="Times New Roman" w:cs="Times New Roman" w:eastAsia="Times New Roman" w:hAnsi="Times New Roman"/>
+                <w:b/>
+                <w:bCs/>
+                <w:i w:val="false"/>
+                <w:iCs w:val="false"/>
+                <w:color w:val="1F4E79"/>
+                <w:sz w:val="22"/>
+                <w:szCs w:val="22"/>
+              </w:rPr>
+              <w:t xml:space="preserve">C</w:t>
+            </w:r>
+          </w:p>
+        </w:tc>
+        <w:tc>
+          <w:tcPr>
+            <w:shd w:fill="EEF4F8" w:val="clear"/>
+            <w:tcMar>
+              <w:top w:type="dxa" w:w="90"/>
+              <w:left w:type="dxa" w:w="100"/>
+              <w:bottom w:type="dxa" w:w="90"/>
+              <w:right w:type="dxa" w:w="100"/>
+            </w:tcMar>
+          </w:tcPr>
+          <w:p>
+            <w:pPr>
+              <w:spacing w:after="0" w:before="0" w:line="300"/>
+              <w:jc w:val="center"/>
+            </w:pPr>
+            <w:r>
+              <w:rPr>
+                <w:rFonts w:ascii="Times New Roman" w:cs="Times New Roman" w:eastAsia="Times New Roman" w:hAnsi="Times New Roman"/>
+                <w:b/>
+                <w:bCs/>
+                <w:i w:val="false"/>
+                <w:iCs w:val="false"/>
+                <w:color w:val="1F4E79"/>
+                <w:sz w:val="22"/>
+                <w:szCs w:val="22"/>
+              </w:rPr>
+              <w:t xml:space="preserve">D</w:t>
+            </w:r>
+          </w:p>
+        </w:tc>
+        <w:tc>
+          <w:tcPr>
+            <w:shd w:fill="EEF4F8" w:val="clear"/>
+            <w:tcMar>
+              <w:top w:type="dxa" w:w="90"/>
+              <w:left w:type="dxa" w:w="100"/>
+              <w:bottom w:type="dxa" w:w="90"/>
+              <w:right w:type="dxa" w:w="100"/>
+            </w:tcMar>
+          </w:tcPr>
+          <w:p>
+            <w:pPr>
+              <w:spacing w:after="0" w:before="0" w:line="300"/>
+              <w:jc w:val="center"/>
+            </w:pPr>
+            <w:r>
+              <w:rPr>
+                <w:rFonts w:ascii="Times New Roman" w:cs="Times New Roman" w:eastAsia="Times New Roman" w:hAnsi="Times New Roman"/>
+                <w:b/>
+                <w:bCs/>
+                <w:i w:val="false"/>
+                <w:iCs w:val="false"/>
+                <w:color w:val="1F4E79"/>
+                <w:sz w:val="22"/>
+                <w:szCs w:val="22"/>
+              </w:rPr>
+              <w:t xml:space="preserve">U</w:t>
+            </w:r>
+          </w:p>
+        </w:tc>
+        <w:tc>
+          <w:tcPr>
+            <w:shd w:fill="E8F5E9" w:val="clear"/>
             <w:tcMar>
               <w:top w:type="dxa" w:w="90"/>
               <w:left w:type="dxa" w:w="100"/>
@@ -234,7 +460,67 @@
                 <w:sz w:val="22"/>
                 <w:szCs w:val="22"/>
               </w:rPr>
-              <w:t xml:space="preserve">C   D   U</w:t>
+              <w:t xml:space="preserve">C</w:t>
+            </w:r>
+          </w:p>
+        </w:tc>
+        <w:tc>
+          <w:tcPr>
+            <w:shd w:fill="E8F5E9" w:val="clear"/>
+            <w:tcMar>
+              <w:top w:type="dxa" w:w="90"/>
+              <w:left w:type="dxa" w:w="100"/>
+              <w:bottom w:type="dxa" w:w="90"/>
+              <w:right w:type="dxa" w:w="100"/>
+            </w:tcMar>
+          </w:tcPr>
+          <w:p>
+            <w:pPr>
+              <w:spacing w:after="0" w:before="0" w:line="300"/>
+              <w:jc w:val="center"/>
+            </w:pPr>
+            <w:r>
+              <w:rPr>
+                <w:rFonts w:ascii="Times New Roman" w:cs="Times New Roman" w:eastAsia="Times New Roman" w:hAnsi="Times New Roman"/>
+                <w:b/>
+                <w:bCs/>
+                <w:i w:val="false"/>
+                <w:iCs w:val="false"/>
+                <w:color w:val="2E7D32"/>
+                <w:sz w:val="22"/>
+                <w:szCs w:val="22"/>
+              </w:rPr>
+              <w:t xml:space="preserve">D</w:t>
+            </w:r>
+          </w:p>
+        </w:tc>
+        <w:tc>
+          <w:tcPr>
+            <w:shd w:fill="E8F5E9" w:val="clear"/>
+            <w:tcMar>
+              <w:top w:type="dxa" w:w="90"/>
+              <w:left w:type="dxa" w:w="100"/>
+              <w:bottom w:type="dxa" w:w="90"/>
+              <w:right w:type="dxa" w:w="100"/>
+            </w:tcMar>
+          </w:tcPr>
+          <w:p>
+            <w:pPr>
+              <w:spacing w:after="0" w:before="0" w:line="300"/>
+              <w:jc w:val="center"/>
+            </w:pPr>
+            <w:r>
+              <w:rPr>
+                <w:rFonts w:ascii="Times New Roman" w:cs="Times New Roman" w:eastAsia="Times New Roman" w:hAnsi="Times New Roman"/>
+                <w:b/>
+                <w:bCs/>
+                <w:i w:val="false"/>
+                <w:iCs w:val="false"/>
+                <w:color w:val="2E7D32"/>
+                <w:sz w:val="22"/>
+                <w:szCs w:val="22"/>
+              </w:rPr>
+              <w:t xml:space="preserve">U</w:t>
             </w:r>
           </w:p>
         </w:tc>
@@ -242,7 +528,6 @@
       <w:tr>
         <w:tc>
           <w:tcPr>
-            <w:tcW w:type="pct" w:w="2500"/>
             <w:tcMar>
               <w:top w:type="dxa" w:w="90"/>
               <w:left w:type="dxa" w:w="100"/>
@@ -262,17 +547,16 @@
                 <w:bCs/>
                 <w:i w:val="false"/>
                 <w:iCs w:val="false"/>
-                <w:color w:val="222222"/>
-                <w:sz w:val="30"/>
-                <w:szCs w:val="30"/>
-              </w:rPr>
-              <w:t xml:space="preserve">3   4   8</w:t>
-            </w:r>
-          </w:p>
-        </w:tc>
-        <w:tc>
-          <w:tcPr>
-            <w:tcW w:type="pct" w:w="2500"/>
+                <w:color w:val="1F4E79"/>
+                <w:sz w:val="28"/>
+                <w:szCs w:val="28"/>
+              </w:rPr>
+              <w:t xml:space="preserve">0</w:t>
+            </w:r>
+          </w:p>
+        </w:tc>
+        <w:tc>
+          <w:tcPr>
             <w:tcMar>
               <w:top w:type="dxa" w:w="90"/>
               <w:left w:type="dxa" w:w="100"/>
@@ -292,11 +576,214 @@
                 <w:bCs/>
                 <w:i w:val="false"/>
                 <w:iCs w:val="false"/>
-                <w:color w:val="222222"/>
-                <w:sz w:val="30"/>
-                <w:szCs w:val="30"/>
-              </w:rPr>
-              <w:t xml:space="preserve">2   5   6</w:t>
+                <w:color w:val="1F4E79"/>
+                <w:sz w:val="28"/>
+                <w:szCs w:val="28"/>
+              </w:rPr>
+              <w:t xml:space="preserve">0</w:t>
+            </w:r>
+          </w:p>
+        </w:tc>
+        <w:tc>
+          <w:tcPr>
+            <w:tcMar>
+              <w:top w:type="dxa" w:w="90"/>
+              <w:left w:type="dxa" w:w="100"/>
+              <w:bottom w:type="dxa" w:w="90"/>
+              <w:right w:type="dxa" w:w="100"/>
+            </w:tcMar>
+          </w:tcPr>
+          <w:p>
+            <w:pPr>
+              <w:spacing w:after="0" w:before="0" w:line="300"/>
+              <w:jc w:val="center"/>
+            </w:pPr>
+            <w:r>
+              <w:rPr>
+                <w:rFonts w:ascii="Times New Roman" w:cs="Times New Roman" w:eastAsia="Times New Roman" w:hAnsi="Times New Roman"/>
+                <w:b/>
+                <w:bCs/>
+                <w:i w:val="false"/>
+                <w:iCs w:val="false"/>
+                <w:color w:val="1F4E79"/>
+                <w:sz w:val="28"/>
+                <w:szCs w:val="28"/>
+              </w:rPr>
+              <w:t xml:space="preserve">2</w:t>
+            </w:r>
+          </w:p>
+        </w:tc>
+        <w:tc>
+          <w:tcPr>
+            <w:tcMar>
+              <w:top w:type="dxa" w:w="90"/>
+              <w:left w:type="dxa" w:w="100"/>
+              <w:bottom w:type="dxa" w:w="90"/>
+              <w:right w:type="dxa" w:w="100"/>
+            </w:tcMar>
+          </w:tcPr>
+          <w:p>
+            <w:pPr>
+              <w:spacing w:after="0" w:before="0" w:line="300"/>
+              <w:jc w:val="center"/>
+            </w:pPr>
+            <w:r>
+              <w:rPr>
+                <w:rFonts w:ascii="Times New Roman" w:cs="Times New Roman" w:eastAsia="Times New Roman" w:hAnsi="Times New Roman"/>
+                <w:b/>
+                <w:bCs/>
+                <w:i w:val="false"/>
+                <w:iCs w:val="false"/>
+                <w:color w:val="1F4E79"/>
+                <w:sz w:val="28"/>
+                <w:szCs w:val="28"/>
+              </w:rPr>
+              <w:t xml:space="preserve">3</w:t>
+            </w:r>
+          </w:p>
+        </w:tc>
+        <w:tc>
+          <w:tcPr>
+            <w:tcMar>
+              <w:top w:type="dxa" w:w="90"/>
+              <w:left w:type="dxa" w:w="100"/>
+              <w:bottom w:type="dxa" w:w="90"/>
+              <w:right w:type="dxa" w:w="100"/>
+            </w:tcMar>
+          </w:tcPr>
+          <w:p>
+            <w:pPr>
+              <w:spacing w:after="0" w:before="0" w:line="300"/>
+              <w:jc w:val="center"/>
+            </w:pPr>
+            <w:r>
+              <w:rPr>
+                <w:rFonts w:ascii="Times New Roman" w:cs="Times New Roman" w:eastAsia="Times New Roman" w:hAnsi="Times New Roman"/>
+                <w:b/>
+                <w:bCs/>
+                <w:i w:val="false"/>
+                <w:iCs w:val="false"/>
+                <w:color w:val="1F4E79"/>
+                <w:sz w:val="28"/>
+                <w:szCs w:val="28"/>
+              </w:rPr>
+              <w:t xml:space="preserve">4</w:t>
+            </w:r>
+          </w:p>
+        </w:tc>
+        <w:tc>
+          <w:tcPr>
+            <w:tcMar>
+              <w:top w:type="dxa" w:w="90"/>
+              <w:left w:type="dxa" w:w="100"/>
+              <w:bottom w:type="dxa" w:w="90"/>
+              <w:right w:type="dxa" w:w="100"/>
+            </w:tcMar>
+          </w:tcPr>
+          <w:p>
+            <w:pPr>
+              <w:spacing w:after="0" w:before="0" w:line="300"/>
+              <w:jc w:val="center"/>
+            </w:pPr>
+            <w:r>
+              <w:rPr>
+                <w:rFonts w:ascii="Times New Roman" w:cs="Times New Roman" w:eastAsia="Times New Roman" w:hAnsi="Times New Roman"/>
+                <w:b/>
+                <w:bCs/>
+                <w:i w:val="false"/>
+                <w:iCs w:val="false"/>
+                <w:color w:val="1F4E79"/>
+                <w:sz w:val="28"/>
+                <w:szCs w:val="28"/>
+              </w:rPr>
+              <w:t xml:space="preserve">3</w:t>
+            </w:r>
+          </w:p>
+        </w:tc>
+        <w:tc>
+          <w:tcPr>
+            <w:tcMar>
+              <w:top w:type="dxa" w:w="90"/>
+              <w:left w:type="dxa" w:w="100"/>
+              <w:bottom w:type="dxa" w:w="90"/>
+              <w:right w:type="dxa" w:w="100"/>
+            </w:tcMar>
+          </w:tcPr>
+          <w:p>
+            <w:pPr>
+              <w:spacing w:after="0" w:before="0" w:line="300"/>
+              <w:jc w:val="center"/>
+            </w:pPr>
+            <w:r>
+              <w:rPr>
+                <w:rFonts w:ascii="Times New Roman" w:cs="Times New Roman" w:eastAsia="Times New Roman" w:hAnsi="Times New Roman"/>
+                <w:b/>
+                <w:bCs/>
+                <w:i w:val="false"/>
+                <w:iCs w:val="false"/>
+                <w:color w:val="2E7D32"/>
+                <w:sz w:val="28"/>
+                <w:szCs w:val="28"/>
+              </w:rPr>
+              <w:t xml:space="preserve">2</w:t>
+            </w:r>
+          </w:p>
+        </w:tc>
+        <w:tc>
+          <w:tcPr>
+            <w:tcMar>
+              <w:top w:type="dxa" w:w="90"/>
+              <w:left w:type="dxa" w:w="100"/>
+              <w:bottom w:type="dxa" w:w="90"/>
+              <w:right w:type="dxa" w:w="100"/>
+            </w:tcMar>
+          </w:tcPr>
+          <w:p>
+            <w:pPr>
+              <w:spacing w:after="0" w:before="0" w:line="300"/>
+              <w:jc w:val="center"/>
+            </w:pPr>
+            <w:r>
+              <w:rPr>
+                <w:rFonts w:ascii="Times New Roman" w:cs="Times New Roman" w:eastAsia="Times New Roman" w:hAnsi="Times New Roman"/>
+                <w:b/>
+                <w:bCs/>
+                <w:i w:val="false"/>
+                <w:iCs w:val="false"/>
+                <w:color w:val="2E7D32"/>
+                <w:sz w:val="28"/>
+                <w:szCs w:val="28"/>
+              </w:rPr>
+              <w:t xml:space="preserve">1</w:t>
+            </w:r>
+          </w:p>
+        </w:tc>
+        <w:tc>
+          <w:tcPr>
+            <w:tcMar>
+              <w:top w:type="dxa" w:w="90"/>
+              <w:left w:type="dxa" w:w="100"/>
+              <w:bottom w:type="dxa" w:w="90"/>
+              <w:right w:type="dxa" w:w="100"/>
+            </w:tcMar>
+          </w:tcPr>
+          <w:p>
+            <w:pPr>
+              <w:spacing w:after="0" w:before="0" w:line="300"/>
+              <w:jc w:val="center"/>
+            </w:pPr>
+            <w:r>
+              <w:rPr>
+                <w:rFonts w:ascii="Times New Roman" w:cs="Times New Roman" w:eastAsia="Times New Roman" w:hAnsi="Times New Roman"/>
+                <w:b/>
+                <w:bCs/>
+                <w:i w:val="false"/>
+                <w:iCs w:val="false"/>
+                <w:color w:val="2E7D32"/>
+                <w:sz w:val="28"/>
+                <w:szCs w:val="28"/>
+              </w:rPr>
+              <w:t xml:space="preserve">6</w:t>
             </w:r>
           </w:p>
         </w:tc>
@@ -304,8 +791,28 @@
     </w:tbl>
     <w:p>
       <w:pPr>
-        <w:spacing w:after="60" w:before="0" w:line="300"/>
-        <w:jc w:val="center"/>
+        <w:spacing w:after="60" w:before="120" w:line="300"/>
+        <w:jc w:val="left"/>
+      </w:pPr>
+      <w:r>
+        <w:rPr>
+          <w:rFonts w:ascii="Times New Roman" w:cs="Times New Roman" w:eastAsia="Times New Roman" w:hAnsi="Times New Roman"/>
+          <w:b w:val="false"/>
+          <w:bCs w:val="false"/>
+          <w:i w:val="false"/>
+          <w:iCs w:val="false"/>
+          <w:color w:val="222222"/>
+          <w:sz w:val="24"/>
+          <w:szCs w:val="24"/>
+        </w:rPr>
+        <w:t xml:space="preserve">On place chaque groupe dans sa classe :</w:t>
+      </w:r>
+    </w:p>
+    <w:p>
+      <w:pPr>
+        <w:shd w:fill="E8F5E9" w:val="clear"/>
+        <w:spacing w:after="110" w:before="0" w:line="300"/>
+        <w:jc w:val="left"/>
       </w:pPr>
       <w:r>
         <w:rPr>
@@ -314,30 +821,11 @@
           <w:bCs/>
           <w:i w:val="false"/>
           <w:iCs w:val="false"/>
-          <w:color w:val="A61C00"/>
-          <w:sz w:val="32"/>
-          <w:szCs w:val="32"/>
-        </w:rPr>
-        <w:t xml:space="preserve">348 | 256</w:t>
-      </w:r>
-    </w:p>
-    <w:p>
-      <w:pPr>
-        <w:spacing w:after="110" w:before="0" w:line="300"/>
-        <w:jc w:val="center"/>
-      </w:pPr>
-      <w:r>
-        <w:rPr>
-          <w:rFonts w:ascii="Times New Roman" w:cs="Times New Roman" w:eastAsia="Times New Roman" w:hAnsi="Times New Roman"/>
-          <w:b w:val="false"/>
-          <w:bCs w:val="false"/>
-          <w:i/>
-          <w:iCs/>
-          <w:color w:val="666666"/>
-          <w:sz w:val="24"/>
-          <w:szCs w:val="24"/>
-        </w:rPr>
-        <w:t xml:space="preserve">La barre sépare les deux classes : 348 mille et 256 unités.</w:t>
+          <w:color w:val="222222"/>
+          <w:sz w:val="24"/>
+          <w:szCs w:val="24"/>
+        </w:rPr>
+        <w:t xml:space="preserve">2 dans les unités de millions ; 343 dans la classe des mille ; 216 dans la classe des unités.</w:t>
       </w:r>
     </w:p>
     <w:p>
@@ -355,7 +843,65 @@
           <w:sz w:val="28"/>
           <w:szCs w:val="28"/>
         </w:rPr>
-        <w:t xml:space="preserve">2. Je lis le nombre</w:t>
+        <w:t xml:space="preserve">2. Lecture</w:t>
+      </w:r>
+    </w:p>
+    <w:p>
+      <w:pPr>
+        <w:spacing w:after="110" w:before="0" w:line="300"/>
+        <w:jc w:val="left"/>
+      </w:pPr>
+      <w:r>
+        <w:rPr>
+          <w:rFonts w:ascii="Times New Roman" w:cs="Times New Roman" w:eastAsia="Times New Roman" w:hAnsi="Times New Roman"/>
+          <w:b w:val="false"/>
+          <w:bCs w:val="false"/>
+          <w:i w:val="false"/>
+          <w:iCs w:val="false"/>
+          <w:color w:val="222222"/>
+          <w:sz w:val="24"/>
+          <w:szCs w:val="24"/>
+        </w:rPr>
+        <w:t xml:space="preserve">On lit de gauche à droite : la première classe, puis le mot « million », ensuite la classe des mille, puis la classe des unités.</w:t>
+      </w:r>
+    </w:p>
+    <w:p>
+      <w:pPr>
+        <w:shd w:fill="E8F5E9" w:val="clear"/>
+        <w:spacing w:after="110" w:before="0" w:line="300"/>
+        <w:jc w:val="left"/>
+      </w:pPr>
+      <w:r>
+        <w:rPr>
+          <w:rFonts w:ascii="Times New Roman" w:cs="Times New Roman" w:eastAsia="Times New Roman" w:hAnsi="Times New Roman"/>
+          <w:b/>
+          <w:bCs/>
+          <w:i w:val="false"/>
+          <w:iCs w:val="false"/>
+          <w:color w:val="222222"/>
+          <w:sz w:val="24"/>
+          <w:szCs w:val="24"/>
+        </w:rPr>
+        <w:t xml:space="preserve">2 343 216 se lit : deux millions trois cent quarante-trois mille deux cent seize.</w:t>
+      </w:r>
+    </w:p>
+    <w:p>
+      <w:pPr>
+        <w:spacing w:after="70" w:before="0" w:line="300"/>
+        <w:jc w:val="left"/>
+      </w:pPr>
+      <w:r>
+        <w:rPr>
+          <w:rFonts w:ascii="Times New Roman" w:cs="Times New Roman" w:eastAsia="Times New Roman" w:hAnsi="Times New Roman"/>
+          <w:b w:val="false"/>
+          <w:bCs w:val="false"/>
+          <w:i w:val="false"/>
+          <w:iCs w:val="false"/>
+          <w:color w:val="222222"/>
+          <w:sz w:val="24"/>
+          <w:szCs w:val="24"/>
+        </w:rPr>
+        <w:t xml:space="preserve">Pour bien lire les nombres, il faut connaître les mots-nombres de 0 à 16, les dizaines, les centaines, puis les mots mille et million.</w:t>
       </w:r>
     </w:p>
     <w:tbl>
@@ -372,14 +918,13 @@
         <w:tblLayout w:type="fixed"/>
       </w:tblPr>
       <w:tblGrid>
-        <w:gridCol w:w="35"/>
-        <w:gridCol w:w="25"/>
-        <w:gridCol w:w="40"/>
+        <w:gridCol w:w="3269"/>
+        <w:gridCol w:w="3269"/>
+        <w:gridCol w:w="3269"/>
       </w:tblGrid>
       <w:tr>
         <w:tc>
           <w:tcPr>
-            <w:tcW w:type="pct" w:w="1750"/>
             <w:shd w:fill="EEF4F8" w:val="clear"/>
             <w:tcMar>
               <w:top w:type="dxa" w:w="90"/>
@@ -400,18 +945,17 @@
                 <w:bCs/>
                 <w:i w:val="false"/>
                 <w:iCs w:val="false"/>
-                <w:color w:val="222222"/>
-                <w:sz w:val="28"/>
-                <w:szCs w:val="28"/>
-              </w:rPr>
-              <w:t xml:space="preserve">348</w:t>
-            </w:r>
-          </w:p>
-        </w:tc>
-        <w:tc>
-          <w:tcPr>
-            <w:tcW w:type="pct" w:w="1250"/>
-            <w:shd w:fill="FFF8E1" w:val="clear"/>
+                <w:color w:val="1F4E79"/>
+                <w:sz w:val="22"/>
+                <w:szCs w:val="22"/>
+              </w:rPr>
+              <w:t xml:space="preserve">0 à 16</w:t>
+            </w:r>
+          </w:p>
+        </w:tc>
+        <w:tc>
+          <w:tcPr>
+            <w:shd w:fill="EEF4F8" w:val="clear"/>
             <w:tcMar>
               <w:top w:type="dxa" w:w="90"/>
               <w:left w:type="dxa" w:w="100"/>
@@ -431,17 +975,16 @@
                 <w:bCs/>
                 <w:i w:val="false"/>
                 <w:iCs w:val="false"/>
-                <w:color w:val="A61C00"/>
-                <w:sz w:val="24"/>
-                <w:szCs w:val="24"/>
-              </w:rPr>
-              <w:t xml:space="preserve">mille</w:t>
-            </w:r>
-          </w:p>
-        </w:tc>
-        <w:tc>
-          <w:tcPr>
-            <w:tcW w:type="pct" w:w="2000"/>
+                <w:color w:val="1F4E79"/>
+                <w:sz w:val="22"/>
+                <w:szCs w:val="22"/>
+              </w:rPr>
+              <w:t xml:space="preserve">Dizaines</w:t>
+            </w:r>
+          </w:p>
+        </w:tc>
+        <w:tc>
+          <w:tcPr>
             <w:shd w:fill="E8F5E9" w:val="clear"/>
             <w:tcMar>
               <w:top w:type="dxa" w:w="90"/>
@@ -462,11 +1005,100 @@
                 <w:bCs/>
                 <w:i w:val="false"/>
                 <w:iCs w:val="false"/>
+                <w:color w:val="2E7D32"/>
+                <w:sz w:val="22"/>
+                <w:szCs w:val="22"/>
+              </w:rPr>
+              <w:t xml:space="preserve">Classes</w:t>
+            </w:r>
+          </w:p>
+        </w:tc>
+      </w:tr>
+      <w:tr>
+        <w:tc>
+          <w:tcPr>
+            <w:tcMar>
+              <w:top w:type="dxa" w:w="90"/>
+              <w:left w:type="dxa" w:w="100"/>
+              <w:bottom w:type="dxa" w:w="90"/>
+              <w:right w:type="dxa" w:w="100"/>
+            </w:tcMar>
+          </w:tcPr>
+          <w:p>
+            <w:pPr>
+              <w:spacing w:after="0" w:before="0" w:line="300"/>
+              <w:jc w:val="left"/>
+            </w:pPr>
+            <w:r>
+              <w:rPr>
+                <w:rFonts w:ascii="Times New Roman" w:cs="Times New Roman" w:eastAsia="Times New Roman" w:hAnsi="Times New Roman"/>
+                <w:b w:val="false"/>
+                <w:bCs w:val="false"/>
+                <w:i w:val="false"/>
+                <w:iCs w:val="false"/>
                 <w:color w:val="222222"/>
-                <w:sz w:val="28"/>
-                <w:szCs w:val="28"/>
-              </w:rPr>
-              <w:t xml:space="preserve">256</w:t>
+                <w:sz w:val="19"/>
+                <w:szCs w:val="19"/>
+              </w:rPr>
+              <w:t xml:space="preserve">zéro, un, deux, trois, quatre, cinq, six, sept, huit, neuf, dix, onze, douze, treize, quatorze, quinze, seize</w:t>
+            </w:r>
+          </w:p>
+        </w:tc>
+        <w:tc>
+          <w:tcPr>
+            <w:tcMar>
+              <w:top w:type="dxa" w:w="90"/>
+              <w:left w:type="dxa" w:w="100"/>
+              <w:bottom w:type="dxa" w:w="90"/>
+              <w:right w:type="dxa" w:w="100"/>
+            </w:tcMar>
+          </w:tcPr>
+          <w:p>
+            <w:pPr>
+              <w:spacing w:after="0" w:before="0" w:line="300"/>
+              <w:jc w:val="left"/>
+            </w:pPr>
+            <w:r>
+              <w:rPr>
+                <w:rFonts w:ascii="Times New Roman" w:cs="Times New Roman" w:eastAsia="Times New Roman" w:hAnsi="Times New Roman"/>
+                <w:b w:val="false"/>
+                <w:bCs w:val="false"/>
+                <w:i w:val="false"/>
+                <w:iCs w:val="false"/>
+                <w:color w:val="222222"/>
+                <w:sz w:val="19"/>
+                <w:szCs w:val="19"/>
+              </w:rPr>
+              <w:t xml:space="preserve">vingt, trente, quarante, cinquante, soixante ; soixante-dix ; quatre-vingts ; quatre-vingt-dix</w:t>
+            </w:r>
+          </w:p>
+        </w:tc>
+        <w:tc>
+          <w:tcPr>
+            <w:tcMar>
+              <w:top w:type="dxa" w:w="90"/>
+              <w:left w:type="dxa" w:w="100"/>
+              <w:bottom w:type="dxa" w:w="90"/>
+              <w:right w:type="dxa" w:w="100"/>
+            </w:tcMar>
+          </w:tcPr>
+          <w:p>
+            <w:pPr>
+              <w:spacing w:after="0" w:before="0" w:line="300"/>
+              <w:jc w:val="left"/>
+            </w:pPr>
+            <w:r>
+              <w:rPr>
+                <w:rFonts w:ascii="Times New Roman" w:cs="Times New Roman" w:eastAsia="Times New Roman" w:hAnsi="Times New Roman"/>
+                <w:b w:val="false"/>
+                <w:bCs w:val="false"/>
+                <w:i w:val="false"/>
+                <w:iCs w:val="false"/>
+                <w:color w:val="222222"/>
+                <w:sz w:val="20"/>
+                <w:szCs w:val="20"/>
+              </w:rPr>
+              <w:t xml:space="preserve">cent, mille, million</w:t>
             </w:r>
           </w:p>
         </w:tc>
@@ -474,26 +1106,8 @@
     </w:tbl>
     <w:p>
       <w:pPr>
-        <w:spacing w:after="110" w:before="0" w:line="300"/>
+        <w:spacing w:after="100" w:before="0" w:line="300"/>
         <w:jc w:val="left"/>
-      </w:pPr>
-      <w:r>
-        <w:rPr>
-          <w:rFonts w:ascii="Times New Roman" w:cs="Times New Roman" w:eastAsia="Times New Roman" w:hAnsi="Times New Roman"/>
-          <w:b/>
-          <w:bCs/>
-          <w:i w:val="false"/>
-          <w:iCs w:val="false"/>
-          <w:color w:val="1F4E79"/>
-          <w:sz w:val="24"/>
-          <w:szCs w:val="24"/>
-        </w:rPr>
-        <w:t xml:space="preserve">348 256 se lit : trois cent quarante-huit mille deux cent cinquante-six.</w:t>
-      </w:r>
-    </w:p>
-    <w:p>
-      <w:pPr>
-        <w:spacing w:after="70" w:line="300"/>
       </w:pPr>
       <w:r>
         <w:rPr>
@@ -506,7 +1120,7 @@
           <w:sz w:val="24"/>
           <w:szCs w:val="24"/>
         </w:rPr>
-        <w:t xml:space="preserve">Je lis de gauche à droite : la première classe, puis le mot « mille », puis la deuxième classe.</w:t>
+        <w:t xml:space="preserve">70 = soixante-dix ; 80 = quatre-vingts ; 90 = quatre-vingt-dix. Le mot mille ne prend jamais de s. Le mot million prend un s quand il y en a plusieurs.</w:t>
       </w:r>
     </w:p>
     <w:p>
@@ -524,12 +1138,13 @@
           <w:sz w:val="28"/>
           <w:szCs w:val="28"/>
         </w:rPr>
-        <w:t xml:space="preserve">3. J’écris le nombre entendu</w:t>
-      </w:r>
-    </w:p>
-    <w:p>
-      <w:pPr>
-        <w:spacing w:after="70" w:line="300"/>
+        <w:t xml:space="preserve">3. Écriture</w:t>
+      </w:r>
+    </w:p>
+    <w:p>
+      <w:pPr>
+        <w:spacing w:after="110" w:before="0" w:line="300"/>
+        <w:jc w:val="left"/>
       </w:pPr>
       <w:r>
         <w:rPr>
@@ -542,91 +1157,28 @@
           <w:sz w:val="24"/>
           <w:szCs w:val="24"/>
         </w:rPr>
-        <w:t xml:space="preserve">« Deux cent trois mille soixante-dix »</w:t>
-      </w:r>
-    </w:p>
-    <w:tbl>
-      <w:tblPr>
-        <w:tblW w:type="pct" w:w="5000"/>
-        <w:tblBorders>
-          <w:top w:val="single" w:color="7593A8" w:sz="6"/>
-          <w:left w:val="single" w:color="7593A8" w:sz="6"/>
-          <w:bottom w:val="single" w:color="7593A8" w:sz="6"/>
-          <w:right w:val="single" w:color="7593A8" w:sz="6"/>
-          <w:insideH w:val="single" w:color="7593A8" w:sz="6"/>
-          <w:insideV w:val="single" w:color="7593A8" w:sz="6"/>
-        </w:tblBorders>
-        <w:tblLayout w:type="fixed"/>
-      </w:tblPr>
-      <w:tblGrid>
-        <w:gridCol w:w="50"/>
-        <w:gridCol w:w="50"/>
-      </w:tblGrid>
-      <w:tr>
-        <w:tc>
-          <w:tcPr>
-            <w:tcW w:type="pct" w:w="2500"/>
-            <w:shd w:fill="EEF4F8" w:val="clear"/>
-            <w:tcMar>
-              <w:top w:type="dxa" w:w="90"/>
-              <w:left w:type="dxa" w:w="100"/>
-              <w:bottom w:type="dxa" w:w="90"/>
-              <w:right w:type="dxa" w:w="100"/>
-            </w:tcMar>
-          </w:tcPr>
-          <w:p>
-            <w:pPr>
-              <w:spacing w:after="0" w:before="0" w:line="300"/>
-              <w:jc w:val="center"/>
-            </w:pPr>
-            <w:r>
-              <w:rPr>
-                <w:rFonts w:ascii="Times New Roman" w:cs="Times New Roman" w:eastAsia="Times New Roman" w:hAnsi="Times New Roman"/>
-                <w:b/>
-                <w:bCs/>
-                <w:i w:val="false"/>
-                <w:iCs w:val="false"/>
-                <w:color w:val="222222"/>
-                <w:sz w:val="28"/>
-                <w:szCs w:val="28"/>
-              </w:rPr>
-              <w:t xml:space="preserve">203</w:t>
-            </w:r>
-          </w:p>
-        </w:tc>
-        <w:tc>
-          <w:tcPr>
-            <w:tcW w:type="pct" w:w="2500"/>
-            <w:shd w:fill="E8F5E9" w:val="clear"/>
-            <w:tcMar>
-              <w:top w:type="dxa" w:w="90"/>
-              <w:left w:type="dxa" w:w="100"/>
-              <w:bottom w:type="dxa" w:w="90"/>
-              <w:right w:type="dxa" w:w="100"/>
-            </w:tcMar>
-          </w:tcPr>
-          <w:p>
-            <w:pPr>
-              <w:spacing w:after="0" w:before="0" w:line="300"/>
-              <w:jc w:val="center"/>
-            </w:pPr>
-            <w:r>
-              <w:rPr>
-                <w:rFonts w:ascii="Times New Roman" w:cs="Times New Roman" w:eastAsia="Times New Roman" w:hAnsi="Times New Roman"/>
-                <w:b/>
-                <w:bCs/>
-                <w:i w:val="false"/>
-                <w:iCs w:val="false"/>
-                <w:color w:val="222222"/>
-                <w:sz w:val="28"/>
-                <w:szCs w:val="28"/>
-              </w:rPr>
-              <w:t xml:space="preserve">070</w:t>
-            </w:r>
-          </w:p>
-        </w:tc>
-      </w:tr>
-    </w:tbl>
+        <w:t xml:space="preserve">Pour écrire un nombre entendu, on cherche d’abord les mots million, mille et unités. On remplit ensuite le tableau de droite à gauche et on ajoute les zéros nécessaires.</w:t>
+      </w:r>
+    </w:p>
+    <w:p>
+      <w:pPr>
+        <w:spacing w:after="60" w:before="0" w:line="300"/>
+        <w:jc w:val="left"/>
+      </w:pPr>
+      <w:r>
+        <w:rPr>
+          <w:rFonts w:ascii="Times New Roman" w:cs="Times New Roman" w:eastAsia="Times New Roman" w:hAnsi="Times New Roman"/>
+          <w:b w:val="false"/>
+          <w:bCs w:val="false"/>
+          <w:i w:val="false"/>
+          <w:iCs w:val="false"/>
+          <w:color w:val="222222"/>
+          <w:sz w:val="24"/>
+          <w:szCs w:val="24"/>
+        </w:rPr>
+        <w:t xml:space="preserve">« Deux millions trois cent quarante-trois mille deux cent seize »</w:t>
+      </w:r>
+    </w:p>
     <w:p>
       <w:pPr>
         <w:spacing w:after="110" w:before="0" w:line="300"/>
@@ -643,43 +1195,7 @@
           <w:sz w:val="24"/>
           <w:szCs w:val="24"/>
         </w:rPr>
-        <w:t xml:space="preserve">Réponse : 203 070.</w:t>
-      </w:r>
-    </w:p>
-    <w:p>
-      <w:pPr>
-        <w:spacing w:after="70" w:line="300"/>
-      </w:pPr>
-      <w:r>
-        <w:rPr>
-          <w:rFonts w:ascii="Times New Roman" w:cs="Times New Roman" w:eastAsia="Times New Roman" w:hAnsi="Times New Roman"/>
-          <w:b w:val="false"/>
-          <w:bCs w:val="false"/>
-          <w:i w:val="false"/>
-          <w:iCs w:val="false"/>
-          <w:color w:val="222222"/>
-          <w:sz w:val="24"/>
-          <w:szCs w:val="24"/>
-        </w:rPr>
-        <w:t xml:space="preserve">Le zéro garde sa place : « soixante-dix » devient 070 dans la classe des unités.</w:t>
-      </w:r>
-    </w:p>
-    <w:p>
-      <w:pPr>
-        <w:spacing w:after="100" w:before="180"/>
-      </w:pPr>
-      <w:r>
-        <w:rPr>
-          <w:rFonts w:ascii="Times New Roman" w:cs="Times New Roman" w:eastAsia="Times New Roman" w:hAnsi="Times New Roman"/>
-          <w:b/>
-          <w:bCs/>
-          <w:i w:val="false"/>
-          <w:iCs w:val="false"/>
-          <w:color w:val="2E7D32"/>
-          <w:sz w:val="28"/>
-          <w:szCs w:val="28"/>
-        </w:rPr>
-        <w:t xml:space="preserve">Règle</w:t>
+        <w:t xml:space="preserve">Réponse : 2 343 216.</w:t>
       </w:r>
     </w:p>
     <w:p>
@@ -691,26 +1207,72 @@
       <w:r>
         <w:rPr>
           <w:rFonts w:ascii="Times New Roman" w:cs="Times New Roman" w:eastAsia="Times New Roman" w:hAnsi="Times New Roman"/>
+          <w:b w:val="false"/>
+          <w:bCs w:val="false"/>
+          <w:i w:val="false"/>
+          <w:iCs w:val="false"/>
+          <w:color w:val="222222"/>
+          <w:sz w:val="24"/>
+          <w:szCs w:val="24"/>
+        </w:rPr>
+        <w:t xml:space="preserve">Une classe doit toujours garder ses trois places. Ainsi, « soixante-dix » s’écrit 070 lorsqu’il se trouve dans la classe des unités.</w:t>
+      </w:r>
+    </w:p>
+    <w:p>
+      <w:pPr>
+        <w:spacing w:after="140" w:before="0" w:line="300"/>
+        <w:jc w:val="left"/>
+      </w:pPr>
+      <w:r>
+        <w:rPr>
+          <w:rFonts w:ascii="Times New Roman" w:cs="Times New Roman" w:eastAsia="Times New Roman" w:hAnsi="Times New Roman"/>
+          <w:b w:val="false"/>
+          <w:bCs w:val="false"/>
+          <w:i/>
+          <w:iCs/>
+          <w:color w:val="222222"/>
+          <w:sz w:val="24"/>
+          <w:szCs w:val="24"/>
+          <w:u w:val="single"/>
+        </w:rPr>
+        <w:t xml:space="preserve">Exemple :</w:t>
+      </w:r>
+      <w:r>
+        <w:rPr>
+          <w:rFonts w:ascii="Times New Roman" w:cs="Times New Roman" w:eastAsia="Times New Roman" w:hAnsi="Times New Roman"/>
+          <w:b w:val="false"/>
+          <w:bCs w:val="false"/>
+          <w:i w:val="false"/>
+          <w:iCs w:val="false"/>
+          <w:color w:val="222222"/>
+          <w:sz w:val="24"/>
+          <w:szCs w:val="24"/>
+        </w:rPr>
+        <w:t xml:space="preserve"> 602 040 se lit « six cent deux mille quarante » ; « quinze mille neuf » s’écrit 15 009.</w:t>
+      </w:r>
+    </w:p>
+    <w:p>
+      <w:pPr>
+        <w:spacing w:after="100" w:before="180"/>
+      </w:pPr>
+      <w:r>
+        <w:rPr>
+          <w:rFonts w:ascii="Times New Roman" w:cs="Times New Roman" w:eastAsia="Times New Roman" w:hAnsi="Times New Roman"/>
           <w:b/>
           <w:bCs/>
           <w:i w:val="false"/>
           <w:iCs w:val="false"/>
-          <w:color w:val="222222"/>
-          <w:sz w:val="24"/>
-          <w:szCs w:val="24"/>
-        </w:rPr>
-        <w:t xml:space="preserve">Pour lire ou écrire un grand nombre, je le sépare en classes de trois chiffres. Je lis chaque classe dans l’ordre et je garde les zéros nécessaires.</w:t>
-      </w:r>
-    </w:p>
-    <w:p>
-      <w:r>
-        <w:br w:type="page"/>
-      </w:r>
-    </w:p>
-    <w:p>
-      <w:pPr>
-        <w:spacing w:after="200" w:before="100"/>
-        <w:jc w:val="center"/>
+          <w:color w:val="1F4E79"/>
+          <w:sz w:val="28"/>
+          <w:szCs w:val="28"/>
+        </w:rPr>
+        <w:t xml:space="preserve">EXERCICE</w:t>
+      </w:r>
+    </w:p>
+    <w:p>
+      <w:pPr>
+        <w:spacing w:after="50" w:before="0" w:line="300"/>
+        <w:jc w:val="left"/>
       </w:pPr>
       <w:r>
         <w:rPr>
@@ -719,16 +1281,17 @@
           <w:bCs/>
           <w:i w:val="false"/>
           <w:iCs w:val="false"/>
-          <w:color w:val="A61C00"/>
-          <w:sz w:val="30"/>
-          <w:szCs w:val="30"/>
-        </w:rPr>
-        <w:t xml:space="preserve">JE M’EXERCE</w:t>
-      </w:r>
-    </w:p>
-    <w:p>
-      <w:pPr>
-        <w:spacing w:after="70" w:line="300"/>
+          <w:color w:val="1F4E79"/>
+          <w:sz w:val="24"/>
+          <w:szCs w:val="24"/>
+        </w:rPr>
+        <w:t xml:space="preserve">1. Écris en lettres :</w:t>
+      </w:r>
+    </w:p>
+    <w:p>
+      <w:pPr>
+        <w:spacing w:after="110" w:before="0" w:line="300"/>
+        <w:jc w:val="left"/>
       </w:pPr>
       <w:r>
         <w:rPr>
@@ -737,16 +1300,36 @@
           <w:bCs w:val="false"/>
           <w:i w:val="false"/>
           <w:iCs w:val="false"/>
+          <w:color w:val="222222"/>
+          <w:sz w:val="24"/>
+          <w:szCs w:val="24"/>
+        </w:rPr>
+        <w:t xml:space="preserve">a) 7 245     b) 83 060     d) 500 500     e) 1 000 000</w:t>
+      </w:r>
+    </w:p>
+    <w:p>
+      <w:pPr>
+        <w:spacing w:after="50" w:before="0" w:line="300"/>
+        <w:jc w:val="left"/>
+      </w:pPr>
+      <w:r>
+        <w:rPr>
+          <w:rFonts w:ascii="Times New Roman" w:cs="Times New Roman" w:eastAsia="Times New Roman" w:hAnsi="Times New Roman"/>
+          <w:b/>
+          <w:bCs/>
+          <w:i w:val="false"/>
+          <w:iCs w:val="false"/>
           <w:color w:val="1F4E79"/>
           <w:sz w:val="24"/>
           <w:szCs w:val="24"/>
         </w:rPr>
-        <w:t xml:space="preserve">1. Écris en lettres :</w:t>
-      </w:r>
-    </w:p>
-    <w:p>
-      <w:pPr>
-        <w:spacing w:after="70" w:line="300"/>
+        <w:t xml:space="preserve">2. Écris en chiffres :</w:t>
+      </w:r>
+    </w:p>
+    <w:p>
+      <w:pPr>
+        <w:spacing w:after="110" w:before="0" w:line="300"/>
+        <w:jc w:val="left"/>
       </w:pPr>
       <w:r>
         <w:rPr>
@@ -759,12 +1342,13 @@
           <w:sz w:val="24"/>
           <w:szCs w:val="24"/>
         </w:rPr>
-        <w:t xml:space="preserve">a) 7 245     b) 83 060     c) 500 500     d) 1 000 000</w:t>
-      </w:r>
-    </w:p>
-    <w:p>
-      <w:pPr>
-        <w:spacing w:after="70" w:line="300"/>
+        <w:t xml:space="preserve">a) douze mille trois cent quatre     b) deux cent mille vingt</w:t>
+      </w:r>
+    </w:p>
+    <w:p>
+      <w:pPr>
+        <w:spacing w:after="110" w:before="0" w:line="300"/>
+        <w:jc w:val="left"/>
       </w:pPr>
       <w:r>
         <w:rPr>
@@ -773,16 +1357,36 @@
           <w:bCs w:val="false"/>
           <w:i w:val="false"/>
           <w:iCs w:val="false"/>
+          <w:color w:val="222222"/>
+          <w:sz w:val="24"/>
+          <w:szCs w:val="24"/>
+        </w:rPr>
+        <w:t xml:space="preserve">d) neuf cent quatre-vingt-dix mille     e) six cent un mille huit</w:t>
+      </w:r>
+    </w:p>
+    <w:p>
+      <w:pPr>
+        <w:spacing w:after="50" w:before="0" w:line="300"/>
+        <w:jc w:val="left"/>
+      </w:pPr>
+      <w:r>
+        <w:rPr>
+          <w:rFonts w:ascii="Times New Roman" w:cs="Times New Roman" w:eastAsia="Times New Roman" w:hAnsi="Times New Roman"/>
+          <w:b/>
+          <w:bCs/>
+          <w:i w:val="false"/>
+          <w:iCs w:val="false"/>
           <w:color w:val="1F4E79"/>
           <w:sz w:val="24"/>
           <w:szCs w:val="24"/>
         </w:rPr>
-        <w:t xml:space="preserve">2. Écris en chiffres :</w:t>
-      </w:r>
-    </w:p>
-    <w:p>
-      <w:pPr>
-        <w:spacing w:after="70" w:line="300"/>
+        <w:t xml:space="preserve">3. Complète :</w:t>
+      </w:r>
+    </w:p>
+    <w:p>
+      <w:pPr>
+        <w:spacing w:after="110" w:before="0" w:line="300"/>
+        <w:jc w:val="left"/>
       </w:pPr>
       <w:r>
         <w:rPr>
@@ -795,12 +1399,13 @@
           <w:sz w:val="24"/>
           <w:szCs w:val="24"/>
         </w:rPr>
-        <w:t xml:space="preserve">a) douze mille trois cent quatre     b) deux cent mille vingt</w:t>
-      </w:r>
-    </w:p>
-    <w:p>
-      <w:pPr>
-        <w:spacing w:after="70" w:line="300"/>
+        <w:t xml:space="preserve">a) 40 007 se lit « … »     b) « trois cent cinq mille neuf » s’écrit …</w:t>
+      </w:r>
+    </w:p>
+    <w:p>
+      <w:pPr>
+        <w:spacing w:after="110" w:before="0" w:line="300"/>
+        <w:jc w:val="left"/>
       </w:pPr>
       <w:r>
         <w:rPr>
@@ -813,12 +1418,32 @@
           <w:sz w:val="24"/>
           <w:szCs w:val="24"/>
         </w:rPr>
-        <w:t xml:space="preserve">c) neuf cent quatre-vingt-dix mille     d) six cent un mille huit</w:t>
-      </w:r>
-    </w:p>
-    <w:p>
-      <w:pPr>
-        <w:spacing w:after="70" w:line="300"/>
+        <w:t xml:space="preserve">d) 203 070 se lit « … »     e) « neuf cent mille six » s’écrit …</w:t>
+      </w:r>
+    </w:p>
+    <w:p>
+      <w:pPr>
+        <w:spacing w:after="50" w:before="0" w:line="300"/>
+        <w:jc w:val="left"/>
+      </w:pPr>
+      <w:r>
+        <w:rPr>
+          <w:rFonts w:ascii="Times New Roman" w:cs="Times New Roman" w:eastAsia="Times New Roman" w:hAnsi="Times New Roman"/>
+          <w:b/>
+          <w:bCs/>
+          <w:i w:val="false"/>
+          <w:iCs w:val="false"/>
+          <w:color w:val="1F4E79"/>
+          <w:sz w:val="24"/>
+          <w:szCs w:val="24"/>
+        </w:rPr>
+        <w:t xml:space="preserve">4. Range dans l’ordre croissant :</w:t>
+      </w:r>
+    </w:p>
+    <w:p>
+      <w:pPr>
+        <w:spacing w:after="110" w:before="0" w:line="300"/>
+        <w:jc w:val="left"/>
       </w:pPr>
       <w:r>
         <w:rPr>
@@ -827,78 +1452,6 @@
           <w:bCs w:val="false"/>
           <w:i w:val="false"/>
           <w:iCs w:val="false"/>
-          <w:color w:val="1F4E79"/>
-          <w:sz w:val="24"/>
-          <w:szCs w:val="24"/>
-        </w:rPr>
-        <w:t xml:space="preserve">3. Complète :</w:t>
-      </w:r>
-    </w:p>
-    <w:p>
-      <w:pPr>
-        <w:spacing w:after="70" w:line="300"/>
-      </w:pPr>
-      <w:r>
-        <w:rPr>
-          <w:rFonts w:ascii="Times New Roman" w:cs="Times New Roman" w:eastAsia="Times New Roman" w:hAnsi="Times New Roman"/>
-          <w:b w:val="false"/>
-          <w:bCs w:val="false"/>
-          <w:i w:val="false"/>
-          <w:iCs w:val="false"/>
-          <w:color w:val="222222"/>
-          <w:sz w:val="24"/>
-          <w:szCs w:val="24"/>
-        </w:rPr>
-        <w:t xml:space="preserve">a) 40 007 se lit « … »     b) « trois cent cinq mille neuf » s’écrit …</w:t>
-      </w:r>
-    </w:p>
-    <w:p>
-      <w:pPr>
-        <w:spacing w:after="70" w:line="300"/>
-      </w:pPr>
-      <w:r>
-        <w:rPr>
-          <w:rFonts w:ascii="Times New Roman" w:cs="Times New Roman" w:eastAsia="Times New Roman" w:hAnsi="Times New Roman"/>
-          <w:b w:val="false"/>
-          <w:bCs w:val="false"/>
-          <w:i w:val="false"/>
-          <w:iCs w:val="false"/>
-          <w:color w:val="222222"/>
-          <w:sz w:val="24"/>
-          <w:szCs w:val="24"/>
-        </w:rPr>
-        <w:t xml:space="preserve">c) 203 070 se lit « … »</w:t>
-      </w:r>
-    </w:p>
-    <w:p>
-      <w:pPr>
-        <w:spacing w:after="70" w:line="300"/>
-      </w:pPr>
-      <w:r>
-        <w:rPr>
-          <w:rFonts w:ascii="Times New Roman" w:cs="Times New Roman" w:eastAsia="Times New Roman" w:hAnsi="Times New Roman"/>
-          <w:b w:val="false"/>
-          <w:bCs w:val="false"/>
-          <w:i w:val="false"/>
-          <w:iCs w:val="false"/>
-          <w:color w:val="1F4E79"/>
-          <w:sz w:val="24"/>
-          <w:szCs w:val="24"/>
-        </w:rPr>
-        <w:t xml:space="preserve">4. Range dans l’ordre croissant :</w:t>
-      </w:r>
-    </w:p>
-    <w:p>
-      <w:pPr>
-        <w:spacing w:after="70" w:line="300"/>
-      </w:pPr>
-      <w:r>
-        <w:rPr>
-          <w:rFonts w:ascii="Times New Roman" w:cs="Times New Roman" w:eastAsia="Times New Roman" w:hAnsi="Times New Roman"/>
-          <w:b w:val="false"/>
-          <w:bCs w:val="false"/>
-          <w:i w:val="false"/>
-          <w:iCs w:val="false"/>
           <w:color w:val="222222"/>
           <w:sz w:val="24"/>
           <w:szCs w:val="24"/>
@@ -917,83 +1470,11 @@
           <w:bCs/>
           <w:i w:val="false"/>
           <w:iCs w:val="false"/>
-          <w:color w:val="2E7D32"/>
+          <w:color w:val="1F4E79"/>
           <w:sz w:val="28"/>
           <w:szCs w:val="28"/>
         </w:rPr>
-        <w:t xml:space="preserve">Je vérifie</w:t>
-      </w:r>
-    </w:p>
-    <w:p>
-      <w:pPr>
-        <w:spacing w:after="70" w:line="300"/>
-      </w:pPr>
-      <w:r>
-        <w:rPr>
-          <w:rFonts w:ascii="Times New Roman" w:cs="Times New Roman" w:eastAsia="Times New Roman" w:hAnsi="Times New Roman"/>
-          <w:b w:val="false"/>
-          <w:bCs w:val="false"/>
-          <w:i w:val="false"/>
-          <w:iCs w:val="false"/>
-          <w:color w:val="222222"/>
-          <w:sz w:val="24"/>
-          <w:szCs w:val="24"/>
-        </w:rPr>
-        <w:t xml:space="preserve">1. a) sept mille deux cent quarante-cinq ; b) quatre-vingt-trois mille soixante ; c) cinq cent mille cinq cents ; d) un million.</w:t>
-      </w:r>
-    </w:p>
-    <w:p>
-      <w:pPr>
-        <w:spacing w:after="70" w:line="300"/>
-      </w:pPr>
-      <w:r>
-        <w:rPr>
-          <w:rFonts w:ascii="Times New Roman" w:cs="Times New Roman" w:eastAsia="Times New Roman" w:hAnsi="Times New Roman"/>
-          <w:b w:val="false"/>
-          <w:bCs w:val="false"/>
-          <w:i w:val="false"/>
-          <w:iCs w:val="false"/>
-          <w:color w:val="222222"/>
-          <w:sz w:val="24"/>
-          <w:szCs w:val="24"/>
-        </w:rPr>
-        <w:t xml:space="preserve">2. a) 12 304 ; b) 200 020 ; c) 990 000 ; d) 601 008.</w:t>
-      </w:r>
-    </w:p>
-    <w:p>
-      <w:pPr>
-        <w:spacing w:after="70" w:line="300"/>
-      </w:pPr>
-      <w:r>
-        <w:rPr>
-          <w:rFonts w:ascii="Times New Roman" w:cs="Times New Roman" w:eastAsia="Times New Roman" w:hAnsi="Times New Roman"/>
-          <w:b w:val="false"/>
-          <w:bCs w:val="false"/>
-          <w:i w:val="false"/>
-          <w:iCs w:val="false"/>
-          <w:color w:val="222222"/>
-          <w:sz w:val="24"/>
-          <w:szCs w:val="24"/>
-        </w:rPr>
-        <w:t xml:space="preserve">3. a) quarante mille sept ; b) 305 009 ; c) deux cent trois mille soixante-dix.</w:t>
-      </w:r>
-    </w:p>
-    <w:p>
-      <w:pPr>
-        <w:spacing w:after="70" w:line="300"/>
-      </w:pPr>
-      <w:r>
-        <w:rPr>
-          <w:rFonts w:ascii="Times New Roman" w:cs="Times New Roman" w:eastAsia="Times New Roman" w:hAnsi="Times New Roman"/>
-          <w:b w:val="false"/>
-          <w:bCs w:val="false"/>
-          <w:i w:val="false"/>
-          <w:iCs w:val="false"/>
-          <w:color w:val="222222"/>
-          <w:sz w:val="24"/>
-          <w:szCs w:val="24"/>
-        </w:rPr>
-        <w:t xml:space="preserve">4. 40 504 &lt; 45 004 &lt; 400 050 &lt; 405 000.</w:t>
+        <w:t xml:space="preserve">Petit problème</w:t>
       </w:r>
     </w:p>
     <w:p>
@@ -1013,7 +1494,180 @@
           <w:sz w:val="24"/>
           <w:szCs w:val="24"/>
         </w:rPr>
-        <w:t xml:space="preserve">À Madagascar, les nombres servent aussi à lire un prix au marché, une population, une distance ou une récolte. La classe des trois chiffres évite les erreurs.</w:t>
+        <w:t xml:space="preserve">Maman gagne 870 000 Ar par mois. Qu’est-ce qui est écrit en lettres sur la fiche de paie ?</w:t>
+      </w:r>
+    </w:p>
+    <w:p>
+      <w:pPr>
+        <w:spacing w:after="100" w:before="180"/>
+      </w:pPr>
+      <w:r>
+        <w:rPr>
+          <w:rFonts w:ascii="Times New Roman" w:cs="Times New Roman" w:eastAsia="Times New Roman" w:hAnsi="Times New Roman"/>
+          <w:b/>
+          <w:bCs/>
+          <w:i w:val="false"/>
+          <w:iCs w:val="false"/>
+          <w:color w:val="1F4E79"/>
+          <w:sz w:val="28"/>
+          <w:szCs w:val="28"/>
+        </w:rPr>
+        <w:t xml:space="preserve">Correction</w:t>
+      </w:r>
+    </w:p>
+    <w:p>
+      <w:pPr>
+        <w:spacing w:after="70" w:line="300"/>
+      </w:pPr>
+      <w:r>
+        <w:rPr>
+          <w:rFonts w:ascii="Times New Roman" w:cs="Times New Roman" w:eastAsia="Times New Roman" w:hAnsi="Times New Roman"/>
+          <w:b/>
+          <w:bCs/>
+          <w:i w:val="false"/>
+          <w:iCs w:val="false"/>
+          <w:color w:val="2E7D32"/>
+          <w:sz w:val="24"/>
+          <w:szCs w:val="24"/>
+        </w:rPr>
+        <w:t xml:space="preserve">1. </w:t>
+      </w:r>
+      <w:r>
+        <w:rPr>
+          <w:rFonts w:ascii="Times New Roman" w:cs="Times New Roman" w:eastAsia="Times New Roman" w:hAnsi="Times New Roman"/>
+          <w:b w:val="false"/>
+          <w:bCs w:val="false"/>
+          <w:i w:val="false"/>
+          <w:iCs w:val="false"/>
+          <w:color w:val="222222"/>
+          <w:sz w:val="24"/>
+          <w:szCs w:val="24"/>
+        </w:rPr>
+        <w:t xml:space="preserve">a) sept mille deux cent quarante-cinq ; b) quatre-vingt-trois mille soixante ; d) cinq cent mille cinq cents ; e) un million.</w:t>
+      </w:r>
+    </w:p>
+    <w:p>
+      <w:pPr>
+        <w:spacing w:after="70" w:line="300"/>
+      </w:pPr>
+      <w:r>
+        <w:rPr>
+          <w:rFonts w:ascii="Times New Roman" w:cs="Times New Roman" w:eastAsia="Times New Roman" w:hAnsi="Times New Roman"/>
+          <w:b/>
+          <w:bCs/>
+          <w:i w:val="false"/>
+          <w:iCs w:val="false"/>
+          <w:color w:val="2E7D32"/>
+          <w:sz w:val="24"/>
+          <w:szCs w:val="24"/>
+        </w:rPr>
+        <w:t xml:space="preserve">2. </w:t>
+      </w:r>
+      <w:r>
+        <w:rPr>
+          <w:rFonts w:ascii="Times New Roman" w:cs="Times New Roman" w:eastAsia="Times New Roman" w:hAnsi="Times New Roman"/>
+          <w:b w:val="false"/>
+          <w:bCs w:val="false"/>
+          <w:i w:val="false"/>
+          <w:iCs w:val="false"/>
+          <w:color w:val="222222"/>
+          <w:sz w:val="24"/>
+          <w:szCs w:val="24"/>
+        </w:rPr>
+        <w:t xml:space="preserve">a) 12 304 ; b) 200 020 ; d) 990 000 ; e) 601 008.</w:t>
+      </w:r>
+    </w:p>
+    <w:p>
+      <w:pPr>
+        <w:spacing w:after="70" w:line="300"/>
+      </w:pPr>
+      <w:r>
+        <w:rPr>
+          <w:rFonts w:ascii="Times New Roman" w:cs="Times New Roman" w:eastAsia="Times New Roman" w:hAnsi="Times New Roman"/>
+          <w:b/>
+          <w:bCs/>
+          <w:i w:val="false"/>
+          <w:iCs w:val="false"/>
+          <w:color w:val="2E7D32"/>
+          <w:sz w:val="24"/>
+          <w:szCs w:val="24"/>
+        </w:rPr>
+        <w:t xml:space="preserve">3. </w:t>
+      </w:r>
+      <w:r>
+        <w:rPr>
+          <w:rFonts w:ascii="Times New Roman" w:cs="Times New Roman" w:eastAsia="Times New Roman" w:hAnsi="Times New Roman"/>
+          <w:b w:val="false"/>
+          <w:bCs w:val="false"/>
+          <w:i w:val="false"/>
+          <w:iCs w:val="false"/>
+          <w:color w:val="222222"/>
+          <w:sz w:val="24"/>
+          <w:szCs w:val="24"/>
+        </w:rPr>
+        <w:t xml:space="preserve">a) quarante mille sept ; b) 305 009 ; d) deux cent trois mille soixante-dix ; e) 900 006.</w:t>
+      </w:r>
+    </w:p>
+    <w:p>
+      <w:pPr>
+        <w:spacing w:after="70" w:line="300"/>
+      </w:pPr>
+      <w:r>
+        <w:rPr>
+          <w:rFonts w:ascii="Times New Roman" w:cs="Times New Roman" w:eastAsia="Times New Roman" w:hAnsi="Times New Roman"/>
+          <w:b/>
+          <w:bCs/>
+          <w:i w:val="false"/>
+          <w:iCs w:val="false"/>
+          <w:color w:val="2E7D32"/>
+          <w:sz w:val="24"/>
+          <w:szCs w:val="24"/>
+        </w:rPr>
+        <w:t xml:space="preserve">4. </w:t>
+      </w:r>
+      <w:r>
+        <w:rPr>
+          <w:rFonts w:ascii="Times New Roman" w:cs="Times New Roman" w:eastAsia="Times New Roman" w:hAnsi="Times New Roman"/>
+          <w:b w:val="false"/>
+          <w:bCs w:val="false"/>
+          <w:i w:val="false"/>
+          <w:iCs w:val="false"/>
+          <w:color w:val="222222"/>
+          <w:sz w:val="24"/>
+          <w:szCs w:val="24"/>
+        </w:rPr>
+        <w:t xml:space="preserve">40 504 &lt; 45 004 &lt; 400 050 &lt; 405 000.</w:t>
+      </w:r>
+    </w:p>
+    <w:p>
+      <w:pPr>
+        <w:spacing w:after="70" w:line="300"/>
+      </w:pPr>
+      <w:r>
+        <w:rPr>
+          <w:rFonts w:ascii="Times New Roman" w:cs="Times New Roman" w:eastAsia="Times New Roman" w:hAnsi="Times New Roman"/>
+          <w:b/>
+          <w:bCs/>
+          <w:i w:val="false"/>
+          <w:iCs w:val="false"/>
+          <w:color w:val="2E7D32"/>
+          <w:sz w:val="24"/>
+          <w:szCs w:val="24"/>
+        </w:rPr>
+        <w:t xml:space="preserve">Petit problème. </w:t>
+      </w:r>
+      <w:r>
+        <w:rPr>
+          <w:rFonts w:ascii="Times New Roman" w:cs="Times New Roman" w:eastAsia="Times New Roman" w:hAnsi="Times New Roman"/>
+          <w:b w:val="false"/>
+          <w:bCs w:val="false"/>
+          <w:i w:val="false"/>
+          <w:iCs w:val="false"/>
+          <w:color w:val="222222"/>
+          <w:sz w:val="24"/>
+          <w:szCs w:val="24"/>
+        </w:rPr>
+        <w:t xml:space="preserve">Huit cent soixante-dix mille ariary.</w:t>
       </w:r>
     </w:p>
     <w:sectPr>

</xml_diff>